<commit_message>
Update defense plan and cheat-sheet documents
Co-Authored-By: Claude Opus 4.8 <noreply@anthropic.com>
</commit_message>
<xml_diff>
--- a/План_доклада_A4.docx
+++ b/План_доклада_A4.docx
@@ -137,7 +137,7 @@
           <w:ilvl w:val="0"/>
           <w:numId w:val="16"/>
         </w:numPr>
-        <w:spacing w:after="0"/>
+        <w:spacing w:after="0" w:line="360" w:lineRule="auto"/>
         <w:ind w:left="0" w:firstLine="142"/>
         <w:rPr>
           <w:rFonts w:ascii="Times New Roman" w:hAnsi="Times New Roman" w:cs="Times New Roman"/>
@@ -163,7 +163,7 @@
           <w:ilvl w:val="0"/>
           <w:numId w:val="16"/>
         </w:numPr>
-        <w:spacing w:after="0"/>
+        <w:spacing w:after="0" w:line="360" w:lineRule="auto"/>
         <w:ind w:left="0" w:firstLine="142"/>
         <w:rPr>
           <w:rFonts w:ascii="Times New Roman" w:hAnsi="Times New Roman" w:cs="Times New Roman"/>
@@ -339,7 +339,7 @@
           <w:ilvl w:val="0"/>
           <w:numId w:val="18"/>
         </w:numPr>
-        <w:spacing w:after="0"/>
+        <w:spacing w:after="0" w:line="360" w:lineRule="auto"/>
         <w:ind w:left="0" w:firstLine="142"/>
         <w:contextualSpacing w:val="0"/>
         <w:rPr>
@@ -410,7 +410,7 @@
           <w:ilvl w:val="0"/>
           <w:numId w:val="18"/>
         </w:numPr>
-        <w:spacing w:after="0"/>
+        <w:spacing w:after="0" w:line="360" w:lineRule="auto"/>
         <w:ind w:left="0" w:firstLine="142"/>
         <w:contextualSpacing w:val="0"/>
         <w:rPr>
@@ -462,7 +462,7 @@
           <w:ilvl w:val="0"/>
           <w:numId w:val="18"/>
         </w:numPr>
-        <w:spacing w:after="0"/>
+        <w:spacing w:after="0" w:line="360" w:lineRule="auto"/>
         <w:ind w:left="0" w:firstLine="142"/>
         <w:contextualSpacing w:val="0"/>
         <w:rPr>
@@ -547,7 +547,7 @@
           <w:ilvl w:val="0"/>
           <w:numId w:val="18"/>
         </w:numPr>
-        <w:spacing w:after="0"/>
+        <w:spacing w:after="0" w:line="360" w:lineRule="auto"/>
         <w:ind w:left="0" w:firstLine="142"/>
         <w:contextualSpacing w:val="0"/>
         <w:rPr>
@@ -628,7 +628,7 @@
           <w:ilvl w:val="0"/>
           <w:numId w:val="18"/>
         </w:numPr>
-        <w:spacing w:after="0"/>
+        <w:spacing w:after="0" w:line="360" w:lineRule="auto"/>
         <w:ind w:left="0" w:firstLine="142"/>
         <w:contextualSpacing w:val="0"/>
         <w:rPr>
@@ -689,7 +689,7 @@
           <w:ilvl w:val="0"/>
           <w:numId w:val="18"/>
         </w:numPr>
-        <w:spacing w:after="0"/>
+        <w:spacing w:after="0" w:line="360" w:lineRule="auto"/>
         <w:ind w:left="0" w:firstLine="142"/>
         <w:contextualSpacing w:val="0"/>
         <w:rPr>
@@ -787,7 +787,7 @@
           <w:ilvl w:val="0"/>
           <w:numId w:val="18"/>
         </w:numPr>
-        <w:spacing w:after="0"/>
+        <w:spacing w:after="0" w:line="360" w:lineRule="auto"/>
         <w:ind w:left="0" w:firstLine="142"/>
         <w:contextualSpacing w:val="0"/>
         <w:rPr>
@@ -848,7 +848,7 @@
           <w:ilvl w:val="0"/>
           <w:numId w:val="18"/>
         </w:numPr>
-        <w:spacing w:after="0"/>
+        <w:spacing w:after="0" w:line="360" w:lineRule="auto"/>
         <w:ind w:left="0" w:firstLine="142"/>
         <w:contextualSpacing w:val="0"/>
         <w:rPr>
@@ -909,7 +909,7 @@
           <w:ilvl w:val="0"/>
           <w:numId w:val="18"/>
         </w:numPr>
-        <w:spacing w:after="0"/>
+        <w:spacing w:after="0" w:line="360" w:lineRule="auto"/>
         <w:ind w:left="0" w:firstLine="142"/>
         <w:contextualSpacing w:val="0"/>
         <w:rPr>
@@ -973,7 +973,7 @@
           <w:ilvl w:val="0"/>
           <w:numId w:val="18"/>
         </w:numPr>
-        <w:spacing w:after="0"/>
+        <w:spacing w:after="0" w:line="360" w:lineRule="auto"/>
         <w:ind w:left="0" w:firstLine="142"/>
         <w:contextualSpacing w:val="0"/>
         <w:rPr>
@@ -1034,7 +1034,7 @@
           <w:ilvl w:val="0"/>
           <w:numId w:val="18"/>
         </w:numPr>
-        <w:spacing w:after="0"/>
+        <w:spacing w:after="0" w:line="360" w:lineRule="auto"/>
         <w:ind w:left="0" w:firstLine="142"/>
         <w:contextualSpacing w:val="0"/>
         <w:rPr>
@@ -1163,23 +1163,29 @@
           <w:ilvl w:val="0"/>
           <w:numId w:val="19"/>
         </w:numPr>
-        <w:spacing w:after="0"/>
+        <w:spacing w:after="0" w:line="360" w:lineRule="auto"/>
         <w:ind w:left="0" w:firstLine="142"/>
         <w:contextualSpacing w:val="0"/>
         <w:rPr>
           <w:rFonts w:ascii="Times New Roman" w:hAnsi="Times New Roman" w:cs="Times New Roman"/>
+          <w:sz w:val="24"/>
+          <w:szCs w:val="24"/>
           <w:lang w:val="ru-RU"/>
         </w:rPr>
       </w:pPr>
       <w:r>
         <w:rPr>
           <w:rFonts w:ascii="Times New Roman" w:hAnsi="Times New Roman" w:cs="Times New Roman"/>
+          <w:sz w:val="24"/>
+          <w:szCs w:val="24"/>
         </w:rPr>
         <w:t>C</w:t>
       </w:r>
       <w:r>
         <w:rPr>
           <w:rFonts w:ascii="Times New Roman" w:hAnsi="Times New Roman" w:cs="Times New Roman"/>
+          <w:sz w:val="24"/>
+          <w:szCs w:val="24"/>
           <w:lang w:val="ru-RU"/>
         </w:rPr>
         <w:t xml:space="preserve">++ — родной для </w:t>
@@ -1187,12 +1193,16 @@
       <w:r>
         <w:rPr>
           <w:rFonts w:ascii="Times New Roman" w:hAnsi="Times New Roman" w:cs="Times New Roman"/>
+          <w:sz w:val="24"/>
+          <w:szCs w:val="24"/>
         </w:rPr>
         <w:t>Unreal</w:t>
       </w:r>
       <w:r>
         <w:rPr>
           <w:rFonts w:ascii="Times New Roman" w:hAnsi="Times New Roman" w:cs="Times New Roman"/>
+          <w:sz w:val="24"/>
+          <w:szCs w:val="24"/>
           <w:lang w:val="ru-RU"/>
         </w:rPr>
         <w:t>, быстрый (машинный код), строгая типизация, ООП</w:t>
@@ -1205,23 +1215,29 @@
           <w:ilvl w:val="0"/>
           <w:numId w:val="19"/>
         </w:numPr>
-        <w:spacing w:after="0"/>
+        <w:spacing w:after="0" w:line="360" w:lineRule="auto"/>
         <w:ind w:left="0" w:firstLine="142"/>
         <w:contextualSpacing w:val="0"/>
         <w:rPr>
           <w:rFonts w:ascii="Times New Roman" w:hAnsi="Times New Roman" w:cs="Times New Roman"/>
+          <w:sz w:val="24"/>
+          <w:szCs w:val="24"/>
           <w:lang w:val="ru-RU"/>
         </w:rPr>
       </w:pPr>
       <w:r>
         <w:rPr>
           <w:rFonts w:ascii="Times New Roman" w:hAnsi="Times New Roman" w:cs="Times New Roman"/>
+          <w:sz w:val="24"/>
+          <w:szCs w:val="24"/>
         </w:rPr>
         <w:t>Unreal</w:t>
       </w:r>
       <w:r>
         <w:rPr>
           <w:rFonts w:ascii="Times New Roman" w:hAnsi="Times New Roman" w:cs="Times New Roman"/>
+          <w:sz w:val="24"/>
+          <w:szCs w:val="24"/>
           <w:lang w:val="ru-RU"/>
         </w:rPr>
         <w:t xml:space="preserve"> </w:t>
@@ -1229,12 +1245,16 @@
       <w:r>
         <w:rPr>
           <w:rFonts w:ascii="Times New Roman" w:hAnsi="Times New Roman" w:cs="Times New Roman"/>
+          <w:sz w:val="24"/>
+          <w:szCs w:val="24"/>
         </w:rPr>
         <w:t>Engine</w:t>
       </w:r>
       <w:r>
         <w:rPr>
           <w:rFonts w:ascii="Times New Roman" w:hAnsi="Times New Roman" w:cs="Times New Roman"/>
+          <w:sz w:val="24"/>
+          <w:szCs w:val="24"/>
           <w:lang w:val="ru-RU"/>
         </w:rPr>
         <w:t xml:space="preserve"> 5 — готовый движок: рендер, система </w:t>
@@ -1242,12 +1262,16 @@
       <w:r>
         <w:rPr>
           <w:rFonts w:ascii="Times New Roman" w:hAnsi="Times New Roman" w:cs="Times New Roman"/>
+          <w:sz w:val="24"/>
+          <w:szCs w:val="24"/>
         </w:rPr>
         <w:t>Actor</w:t>
       </w:r>
       <w:r>
         <w:rPr>
           <w:rFonts w:ascii="Times New Roman" w:hAnsi="Times New Roman" w:cs="Times New Roman"/>
+          <w:sz w:val="24"/>
+          <w:szCs w:val="24"/>
           <w:lang w:val="ru-RU"/>
         </w:rPr>
         <w:t>, анимации, коллизии, редактор</w:t>
@@ -1260,23 +1284,29 @@
           <w:ilvl w:val="0"/>
           <w:numId w:val="19"/>
         </w:numPr>
-        <w:spacing w:after="0"/>
+        <w:spacing w:after="0" w:line="360" w:lineRule="auto"/>
         <w:ind w:left="0" w:firstLine="142"/>
         <w:contextualSpacing w:val="0"/>
         <w:rPr>
           <w:rFonts w:ascii="Times New Roman" w:hAnsi="Times New Roman" w:cs="Times New Roman"/>
+          <w:sz w:val="24"/>
+          <w:szCs w:val="24"/>
           <w:lang w:val="ru-RU"/>
         </w:rPr>
       </w:pPr>
       <w:r>
         <w:rPr>
           <w:rFonts w:ascii="Times New Roman" w:hAnsi="Times New Roman" w:cs="Times New Roman"/>
+          <w:sz w:val="24"/>
+          <w:szCs w:val="24"/>
         </w:rPr>
         <w:t>Blueprint</w:t>
       </w:r>
       <w:r>
         <w:rPr>
           <w:rFonts w:ascii="Times New Roman" w:hAnsi="Times New Roman" w:cs="Times New Roman"/>
+          <w:sz w:val="24"/>
+          <w:szCs w:val="24"/>
           <w:lang w:val="ru-RU"/>
         </w:rPr>
         <w:t xml:space="preserve"> + </w:t>
@@ -1284,12 +1314,16 @@
       <w:r>
         <w:rPr>
           <w:rFonts w:ascii="Times New Roman" w:hAnsi="Times New Roman" w:cs="Times New Roman"/>
+          <w:sz w:val="24"/>
+          <w:szCs w:val="24"/>
         </w:rPr>
         <w:t>Enhanced</w:t>
       </w:r>
       <w:r>
         <w:rPr>
           <w:rFonts w:ascii="Times New Roman" w:hAnsi="Times New Roman" w:cs="Times New Roman"/>
+          <w:sz w:val="24"/>
+          <w:szCs w:val="24"/>
           <w:lang w:val="ru-RU"/>
         </w:rPr>
         <w:t xml:space="preserve"> </w:t>
@@ -1297,12 +1331,16 @@
       <w:r>
         <w:rPr>
           <w:rFonts w:ascii="Times New Roman" w:hAnsi="Times New Roman" w:cs="Times New Roman"/>
+          <w:sz w:val="24"/>
+          <w:szCs w:val="24"/>
         </w:rPr>
         <w:t>Input</w:t>
       </w:r>
       <w:r>
         <w:rPr>
           <w:rFonts w:ascii="Times New Roman" w:hAnsi="Times New Roman" w:cs="Times New Roman"/>
+          <w:sz w:val="24"/>
+          <w:szCs w:val="24"/>
           <w:lang w:val="ru-RU"/>
         </w:rPr>
         <w:t xml:space="preserve"> — визуальная настройка </w:t>
@@ -1311,6 +1349,8 @@
       <w:r>
         <w:rPr>
           <w:rFonts w:ascii="Times New Roman" w:hAnsi="Times New Roman" w:cs="Times New Roman"/>
+          <w:sz w:val="24"/>
+          <w:szCs w:val="24"/>
           <w:lang w:val="ru-RU"/>
         </w:rPr>
         <w:t>ассетов</w:t>
@@ -1319,6 +1359,8 @@
       <w:r>
         <w:rPr>
           <w:rFonts w:ascii="Times New Roman" w:hAnsi="Times New Roman" w:cs="Times New Roman"/>
+          <w:sz w:val="24"/>
+          <w:szCs w:val="24"/>
           <w:lang w:val="ru-RU"/>
         </w:rPr>
         <w:t xml:space="preserve"> и ввода поверх </w:t>
@@ -1326,12 +1368,16 @@
       <w:r>
         <w:rPr>
           <w:rFonts w:ascii="Times New Roman" w:hAnsi="Times New Roman" w:cs="Times New Roman"/>
+          <w:sz w:val="24"/>
+          <w:szCs w:val="24"/>
         </w:rPr>
         <w:t>C</w:t>
       </w:r>
       <w:r>
         <w:rPr>
           <w:rFonts w:ascii="Times New Roman" w:hAnsi="Times New Roman" w:cs="Times New Roman"/>
+          <w:sz w:val="24"/>
+          <w:szCs w:val="24"/>
           <w:lang w:val="ru-RU"/>
         </w:rPr>
         <w:t>++</w:t>
@@ -1344,23 +1390,29 @@
           <w:ilvl w:val="0"/>
           <w:numId w:val="19"/>
         </w:numPr>
-        <w:spacing w:after="0"/>
+        <w:spacing w:after="0" w:line="360" w:lineRule="auto"/>
         <w:ind w:left="0" w:firstLine="142"/>
         <w:contextualSpacing w:val="0"/>
         <w:rPr>
           <w:rFonts w:ascii="Times New Roman" w:hAnsi="Times New Roman" w:cs="Times New Roman"/>
+          <w:sz w:val="24"/>
+          <w:szCs w:val="24"/>
           <w:lang w:val="ru-RU"/>
         </w:rPr>
       </w:pPr>
       <w:r>
         <w:rPr>
           <w:rFonts w:ascii="Times New Roman" w:hAnsi="Times New Roman" w:cs="Times New Roman"/>
+          <w:sz w:val="24"/>
+          <w:szCs w:val="24"/>
         </w:rPr>
         <w:t>JSON</w:t>
       </w:r>
       <w:r>
         <w:rPr>
           <w:rFonts w:ascii="Times New Roman" w:hAnsi="Times New Roman" w:cs="Times New Roman"/>
+          <w:sz w:val="24"/>
+          <w:szCs w:val="24"/>
           <w:lang w:val="ru-RU"/>
         </w:rPr>
         <w:t xml:space="preserve"> — простое и читаемое сохранение прогресса и настроек, без сложной базы данных</w:t>
@@ -1373,23 +1425,29 @@
           <w:ilvl w:val="0"/>
           <w:numId w:val="19"/>
         </w:numPr>
-        <w:spacing w:after="0"/>
+        <w:spacing w:after="0" w:line="360" w:lineRule="auto"/>
         <w:ind w:left="0" w:firstLine="142"/>
         <w:contextualSpacing w:val="0"/>
         <w:rPr>
           <w:rFonts w:ascii="Times New Roman" w:hAnsi="Times New Roman" w:cs="Times New Roman"/>
+          <w:sz w:val="24"/>
+          <w:szCs w:val="24"/>
           <w:lang w:val="ru-RU"/>
         </w:rPr>
       </w:pPr>
       <w:r>
         <w:rPr>
           <w:rFonts w:ascii="Times New Roman" w:hAnsi="Times New Roman" w:cs="Times New Roman"/>
+          <w:sz w:val="24"/>
+          <w:szCs w:val="24"/>
         </w:rPr>
         <w:t>Visual</w:t>
       </w:r>
       <w:r>
         <w:rPr>
           <w:rFonts w:ascii="Times New Roman" w:hAnsi="Times New Roman" w:cs="Times New Roman"/>
+          <w:sz w:val="24"/>
+          <w:szCs w:val="24"/>
           <w:lang w:val="ru-RU"/>
         </w:rPr>
         <w:t xml:space="preserve"> </w:t>
@@ -1397,12 +1455,16 @@
       <w:r>
         <w:rPr>
           <w:rFonts w:ascii="Times New Roman" w:hAnsi="Times New Roman" w:cs="Times New Roman"/>
+          <w:sz w:val="24"/>
+          <w:szCs w:val="24"/>
         </w:rPr>
         <w:t>Studio</w:t>
       </w:r>
       <w:r>
         <w:rPr>
           <w:rFonts w:ascii="Times New Roman" w:hAnsi="Times New Roman" w:cs="Times New Roman"/>
+          <w:sz w:val="24"/>
+          <w:szCs w:val="24"/>
           <w:lang w:val="ru-RU"/>
         </w:rPr>
         <w:t xml:space="preserve"> 2022 — среда </w:t>
@@ -1411,6 +1473,8 @@
       <w:r>
         <w:rPr>
           <w:rFonts w:ascii="Times New Roman" w:hAnsi="Times New Roman" w:cs="Times New Roman"/>
+          <w:sz w:val="24"/>
+          <w:szCs w:val="24"/>
           <w:lang w:val="ru-RU"/>
         </w:rPr>
         <w:t xml:space="preserve">разработки;  </w:t>
@@ -1418,6 +1482,8 @@
       <w:r>
         <w:rPr>
           <w:rFonts w:ascii="Times New Roman" w:hAnsi="Times New Roman" w:cs="Times New Roman"/>
+          <w:sz w:val="24"/>
+          <w:szCs w:val="24"/>
         </w:rPr>
         <w:t>Git</w:t>
       </w:r>
@@ -1425,6 +1491,8 @@
       <w:r>
         <w:rPr>
           <w:rFonts w:ascii="Times New Roman" w:hAnsi="Times New Roman" w:cs="Times New Roman"/>
+          <w:sz w:val="24"/>
+          <w:szCs w:val="24"/>
           <w:lang w:val="ru-RU"/>
         </w:rPr>
         <w:t xml:space="preserve"> — контроль версий и история</w:t>
@@ -1477,16 +1545,20 @@
           <w:ilvl w:val="0"/>
           <w:numId w:val="20"/>
         </w:numPr>
-        <w:spacing w:after="0"/>
+        <w:spacing w:after="0" w:line="360" w:lineRule="auto"/>
         <w:ind w:left="0" w:firstLine="142"/>
         <w:rPr>
           <w:rFonts w:ascii="Times New Roman" w:hAnsi="Times New Roman" w:cs="Times New Roman"/>
+          <w:sz w:val="24"/>
+          <w:szCs w:val="24"/>
           <w:lang w:val="ru-RU"/>
         </w:rPr>
       </w:pPr>
       <w:r>
         <w:rPr>
           <w:rFonts w:ascii="Times New Roman" w:hAnsi="Times New Roman" w:cs="Times New Roman"/>
+          <w:sz w:val="24"/>
+          <w:szCs w:val="24"/>
           <w:lang w:val="ru-RU"/>
         </w:rPr>
         <w:t xml:space="preserve">Сделано: законченная основа </w:t>
@@ -1494,12 +1566,16 @@
       <w:r>
         <w:rPr>
           <w:rFonts w:ascii="Times New Roman" w:hAnsi="Times New Roman" w:cs="Times New Roman"/>
+          <w:sz w:val="24"/>
+          <w:szCs w:val="24"/>
         </w:rPr>
         <w:t>RPG</w:t>
       </w:r>
       <w:r>
         <w:rPr>
           <w:rFonts w:ascii="Times New Roman" w:hAnsi="Times New Roman" w:cs="Times New Roman"/>
+          <w:sz w:val="24"/>
+          <w:szCs w:val="24"/>
           <w:lang w:val="ru-RU"/>
         </w:rPr>
         <w:t>, все системы связаны между собой</w:t>
@@ -1512,16 +1588,20 @@
           <w:ilvl w:val="0"/>
           <w:numId w:val="20"/>
         </w:numPr>
-        <w:spacing w:after="0"/>
+        <w:spacing w:after="0" w:line="360" w:lineRule="auto"/>
         <w:ind w:left="0" w:firstLine="142"/>
         <w:rPr>
           <w:rFonts w:ascii="Times New Roman" w:hAnsi="Times New Roman" w:cs="Times New Roman"/>
+          <w:sz w:val="24"/>
+          <w:szCs w:val="24"/>
           <w:lang w:val="ru-RU"/>
         </w:rPr>
       </w:pPr>
       <w:r>
         <w:rPr>
           <w:rFonts w:ascii="Times New Roman" w:hAnsi="Times New Roman" w:cs="Times New Roman"/>
+          <w:sz w:val="24"/>
+          <w:szCs w:val="24"/>
           <w:lang w:val="ru-RU"/>
         </w:rPr>
         <w:t>Дальше: новые виды руды, расширенная экономика, визуальные эффекты, мультиплеер</w:t>

</xml_diff>